<commit_message>
Embed Task 1, 2, and 4 screenshots into solution docx/pdf; add real links
</commit_message>
<xml_diff>
--- a/Assignments/Assignment01/Assignment01_Solution.docx
+++ b/Assignments/Assignment01/Assignment01_Solution.docx
@@ -121,78 +121,52 @@
         <w:t xml:space="preserve">Installed Docker Engine and curl, installed the Docker Compose CLI plugin, started the Docker service, and added my Ubuntu user to the docker group. Verified git, docker, and docker compose versions. Cloned the instructor-provided Gitea setup repository and started Gitea and PostgreSQL with docker compose up -d. Confirmed both containers were running and that Gitea responded on port 3000. Completed the Gitea web installation using the required PostgreSQL database settings.</w:t>
       </w:r>
     </w:p>
-    <w:tbl>
-      <w:tblPr>
-        <w:tblW w:type="dxa" w:w="9350"/>
-        <w:tblBorders>
-          <w:top w:val="single" w:color="auto" w:sz="4"/>
-          <w:left w:val="single" w:color="auto" w:sz="4"/>
-          <w:bottom w:val="single" w:color="auto" w:sz="4"/>
-          <w:right w:val="single" w:color="auto" w:sz="4"/>
-          <w:insideH w:val="single" w:color="auto" w:sz="4"/>
-          <w:insideV w:val="single" w:color="auto" w:sz="4"/>
-        </w:tblBorders>
-      </w:tblPr>
-      <w:tblGrid>
-        <w:gridCol w:w="9350"/>
-      </w:tblGrid>
-      <w:tr>
-        <w:tc>
-          <w:tcPr>
-            <w:tcW w:type="dxa" w:w="9350"/>
-            <w:tcBorders>
-              <w:top w:val="single" w:color="BF9000" w:sz="6"/>
-              <w:left w:val="single" w:color="BF9000" w:sz="6"/>
-              <w:bottom w:val="single" w:color="BF9000" w:sz="6"/>
-              <w:right w:val="single" w:color="BF9000" w:sz="6"/>
-            </w:tcBorders>
-            <w:shd w:fill="FFF2CC" w:val="clear"/>
-            <w:tcMar>
-              <w:top w:type="dxa" w:w="150"/>
-              <w:left w:type="dxa" w:w="150"/>
-              <w:bottom w:type="dxa" w:w="150"/>
-              <w:right w:type="dxa" w:w="150"/>
-            </w:tcMar>
-          </w:tcPr>
-          <w:p>
-            <w:pPr>
-              <w:spacing w:after="60"/>
-            </w:pPr>
-            <w:r>
-              <w:rPr>
-                <w:b/>
-                <w:bCs/>
-                <w:color w:val="BF9000"/>
-              </w:rPr>
-              <w:t xml:space="preserve">SCREENSHOT PENDING</w:t>
-            </w:r>
-          </w:p>
-          <w:p>
-            <w:pPr>
-              <w:spacing w:after="60"/>
-            </w:pPr>
-            <w:r>
-              <w:rPr>
-                <w:b/>
-                <w:bCs/>
-                <w:i/>
-                <w:iCs/>
-              </w:rPr>
-              <w:t xml:space="preserve">File: task1_gitea_running.png</w:t>
-            </w:r>
-          </w:p>
-          <w:p>
-            <w:r>
-              <w:rPr>
-                <w:i/>
-                <w:iCs/>
-              </w:rPr>
-              <w:t xml:space="preserve">Must show: &lt;github-username&gt;@ubuntu prompt, the docker compose ps command with both Gitea and PostgreSQL running, and the successful Gitea HTTP status.</w:t>
-            </w:r>
-          </w:p>
-        </w:tc>
-      </w:tr>
-    </w:tbl>
+    <w:p>
+      <w:pPr>
+        <w:spacing w:after="100"/>
+        <w:jc w:val="center"/>
+      </w:pPr>
+      <w:r>
+        <w:drawing>
+          <wp:inline distT="0" distB="0" distL="0" distR="0">
+            <wp:extent cx="5334000" cy="2914650"/>
+            <wp:effectExtent t="0" r="0" b="0" l="0"/>
+            <wp:docPr id="1" name="" descr="" title=""/>
+            <wp:cNvGraphicFramePr>
+              <a:graphicFrameLocks xmlns:a="http://schemas.openxmlformats.org/drawingml/2006/main" noChangeAspect="1"/>
+            </wp:cNvGraphicFramePr>
+            <a:graphic xmlns:a="http://schemas.openxmlformats.org/drawingml/2006/main">
+              <a:graphicData uri="http://schemas.openxmlformats.org/drawingml/2006/picture">
+                <pic:pic xmlns:pic="http://schemas.openxmlformats.org/drawingml/2006/picture">
+                  <pic:nvPicPr>
+                    <pic:cNvPr id="0" name="" descr=""/>
+                    <pic:cNvPicPr>
+                      <a:picLocks noChangeAspect="1" noChangeArrowheads="1"/>
+                    </pic:cNvPicPr>
+                  </pic:nvPicPr>
+                  <pic:blipFill>
+                    <a:blip r:embed="rId7" cstate="none"/>
+                    <a:srcRect/>
+                    <a:stretch>
+                      <a:fillRect/>
+                    </a:stretch>
+                  </pic:blipFill>
+                  <pic:spPr bwMode="auto">
+                    <a:xfrm>
+                      <a:off x="0" y="0"/>
+                      <a:ext cx="5334000" cy="2914650"/>
+                    </a:xfrm>
+                    <a:prstGeom prst="rect">
+                      <a:avLst/>
+                    </a:prstGeom>
+                  </pic:spPr>
+                </pic:pic>
+              </a:graphicData>
+            </a:graphic>
+          </wp:inline>
+        </w:drawing>
+      </w:r>
+    </w:p>
     <w:p>
       <w:pPr>
         <w:spacing w:after="200"/>
@@ -215,78 +189,52 @@
         <w:t xml:space="preserve">Created an empty public repository named Assignment01 in Gitea (no README/.gitignore/license). On the Ubuntu server, created a separate local repository, added a README.md with my full name and registration number, and committed it. Generated a Gitea personal access token (ubuntu-server-token, write:repository scope). Added the gitea remote (username only, no token in the URL) and pushed the initial commit using the token as the password when prompted.</w:t>
       </w:r>
     </w:p>
-    <w:tbl>
-      <w:tblPr>
-        <w:tblW w:type="dxa" w:w="9350"/>
-        <w:tblBorders>
-          <w:top w:val="single" w:color="auto" w:sz="4"/>
-          <w:left w:val="single" w:color="auto" w:sz="4"/>
-          <w:bottom w:val="single" w:color="auto" w:sz="4"/>
-          <w:right w:val="single" w:color="auto" w:sz="4"/>
-          <w:insideH w:val="single" w:color="auto" w:sz="4"/>
-          <w:insideV w:val="single" w:color="auto" w:sz="4"/>
-        </w:tblBorders>
-      </w:tblPr>
-      <w:tblGrid>
-        <w:gridCol w:w="9350"/>
-      </w:tblGrid>
-      <w:tr>
-        <w:tc>
-          <w:tcPr>
-            <w:tcW w:type="dxa" w:w="9350"/>
-            <w:tcBorders>
-              <w:top w:val="single" w:color="BF9000" w:sz="6"/>
-              <w:left w:val="single" w:color="BF9000" w:sz="6"/>
-              <w:bottom w:val="single" w:color="BF9000" w:sz="6"/>
-              <w:right w:val="single" w:color="BF9000" w:sz="6"/>
-            </w:tcBorders>
-            <w:shd w:fill="FFF2CC" w:val="clear"/>
-            <w:tcMar>
-              <w:top w:type="dxa" w:w="150"/>
-              <w:left w:type="dxa" w:w="150"/>
-              <w:bottom w:type="dxa" w:w="150"/>
-              <w:right w:type="dxa" w:w="150"/>
-            </w:tcMar>
-          </w:tcPr>
-          <w:p>
-            <w:pPr>
-              <w:spacing w:after="60"/>
-            </w:pPr>
-            <w:r>
-              <w:rPr>
-                <w:b/>
-                <w:bCs/>
-                <w:color w:val="BF9000"/>
-              </w:rPr>
-              <w:t xml:space="preserve">SCREENSHOT PENDING</w:t>
-            </w:r>
-          </w:p>
-          <w:p>
-            <w:pPr>
-              <w:spacing w:after="60"/>
-            </w:pPr>
-            <w:r>
-              <w:rPr>
-                <w:b/>
-                <w:bCs/>
-                <w:i/>
-                <w:iCs/>
-              </w:rPr>
-              <w:t xml:space="preserve">File: task1_gitea_push.png</w:t>
-            </w:r>
-          </w:p>
-          <w:p>
-            <w:r>
-              <w:rPr>
-                <w:i/>
-                <w:iCs/>
-              </w:rPr>
-              <w:t xml:space="preserve">Must show: the git push command, the gitea remote, a successful push, and the &lt;github-username&gt;@ubuntu prompt. No token visible.</w:t>
-            </w:r>
-          </w:p>
-        </w:tc>
-      </w:tr>
-    </w:tbl>
+    <w:p>
+      <w:pPr>
+        <w:spacing w:after="100"/>
+        <w:jc w:val="center"/>
+      </w:pPr>
+      <w:r>
+        <w:drawing>
+          <wp:inline distT="0" distB="0" distL="0" distR="0">
+            <wp:extent cx="5010150" cy="3429000"/>
+            <wp:effectExtent t="0" r="0" b="0" l="0"/>
+            <wp:docPr id="2" name="" descr="" title=""/>
+            <wp:cNvGraphicFramePr>
+              <a:graphicFrameLocks xmlns:a="http://schemas.openxmlformats.org/drawingml/2006/main" noChangeAspect="1"/>
+            </wp:cNvGraphicFramePr>
+            <a:graphic xmlns:a="http://schemas.openxmlformats.org/drawingml/2006/main">
+              <a:graphicData uri="http://schemas.openxmlformats.org/drawingml/2006/picture">
+                <pic:pic xmlns:pic="http://schemas.openxmlformats.org/drawingml/2006/picture">
+                  <pic:nvPicPr>
+                    <pic:cNvPr id="0" name="" descr=""/>
+                    <pic:cNvPicPr>
+                      <a:picLocks noChangeAspect="1" noChangeArrowheads="1"/>
+                    </pic:cNvPicPr>
+                  </pic:nvPicPr>
+                  <pic:blipFill>
+                    <a:blip r:embed="rId8" cstate="none"/>
+                    <a:srcRect/>
+                    <a:stretch>
+                      <a:fillRect/>
+                    </a:stretch>
+                  </pic:blipFill>
+                  <pic:spPr bwMode="auto">
+                    <a:xfrm>
+                      <a:off x="0" y="0"/>
+                      <a:ext cx="5010150" cy="3429000"/>
+                    </a:xfrm>
+                    <a:prstGeom prst="rect">
+                      <a:avLst/>
+                    </a:prstGeom>
+                  </pic:spPr>
+                </pic:pic>
+              </a:graphicData>
+            </a:graphic>
+          </wp:inline>
+        </w:drawing>
+      </w:r>
+    </w:p>
     <w:p>
       <w:pPr>
         <w:spacing w:after="200"/>
@@ -309,78 +257,52 @@
         <w:t xml:space="preserve">Opened the Assignment01 repository in Gitea and confirmed the repository owner, repository name, that it is public, and that the rendered README.md shows my full name and registration number.</w:t>
       </w:r>
     </w:p>
-    <w:tbl>
-      <w:tblPr>
-        <w:tblW w:type="dxa" w:w="9350"/>
-        <w:tblBorders>
-          <w:top w:val="single" w:color="auto" w:sz="4"/>
-          <w:left w:val="single" w:color="auto" w:sz="4"/>
-          <w:bottom w:val="single" w:color="auto" w:sz="4"/>
-          <w:right w:val="single" w:color="auto" w:sz="4"/>
-          <w:insideH w:val="single" w:color="auto" w:sz="4"/>
-          <w:insideV w:val="single" w:color="auto" w:sz="4"/>
-        </w:tblBorders>
-      </w:tblPr>
-      <w:tblGrid>
-        <w:gridCol w:w="9350"/>
-      </w:tblGrid>
-      <w:tr>
-        <w:tc>
-          <w:tcPr>
-            <w:tcW w:type="dxa" w:w="9350"/>
-            <w:tcBorders>
-              <w:top w:val="single" w:color="BF9000" w:sz="6"/>
-              <w:left w:val="single" w:color="BF9000" w:sz="6"/>
-              <w:bottom w:val="single" w:color="BF9000" w:sz="6"/>
-              <w:right w:val="single" w:color="BF9000" w:sz="6"/>
-            </w:tcBorders>
-            <w:shd w:fill="FFF2CC" w:val="clear"/>
-            <w:tcMar>
-              <w:top w:type="dxa" w:w="150"/>
-              <w:left w:type="dxa" w:w="150"/>
-              <w:bottom w:type="dxa" w:w="150"/>
-              <w:right w:type="dxa" w:w="150"/>
-            </w:tcMar>
-          </w:tcPr>
-          <w:p>
-            <w:pPr>
-              <w:spacing w:after="60"/>
-            </w:pPr>
-            <w:r>
-              <w:rPr>
-                <w:b/>
-                <w:bCs/>
-                <w:color w:val="BF9000"/>
-              </w:rPr>
-              <w:t xml:space="preserve">SCREENSHOT PENDING</w:t>
-            </w:r>
-          </w:p>
-          <w:p>
-            <w:pPr>
-              <w:spacing w:after="60"/>
-            </w:pPr>
-            <w:r>
-              <w:rPr>
-                <w:b/>
-                <w:bCs/>
-                <w:i/>
-                <w:iCs/>
-              </w:rPr>
-              <w:t xml:space="preserve">File: task1_gitea_repository.png</w:t>
-            </w:r>
-          </w:p>
-          <w:p>
-            <w:r>
-              <w:rPr>
-                <w:i/>
-                <w:iCs/>
-              </w:rPr>
-              <w:t xml:space="preserve">Must show: the Gitea repository page with owner, name, public status, and rendered README visible.</w:t>
-            </w:r>
-          </w:p>
-        </w:tc>
-      </w:tr>
-    </w:tbl>
+    <w:p>
+      <w:pPr>
+        <w:spacing w:after="100"/>
+        <w:jc w:val="center"/>
+      </w:pPr>
+      <w:r>
+        <w:drawing>
+          <wp:inline distT="0" distB="0" distL="0" distR="0">
+            <wp:extent cx="4657725" cy="3429000"/>
+            <wp:effectExtent t="0" r="0" b="0" l="0"/>
+            <wp:docPr id="3" name="" descr="" title=""/>
+            <wp:cNvGraphicFramePr>
+              <a:graphicFrameLocks xmlns:a="http://schemas.openxmlformats.org/drawingml/2006/main" noChangeAspect="1"/>
+            </wp:cNvGraphicFramePr>
+            <a:graphic xmlns:a="http://schemas.openxmlformats.org/drawingml/2006/main">
+              <a:graphicData uri="http://schemas.openxmlformats.org/drawingml/2006/picture">
+                <pic:pic xmlns:pic="http://schemas.openxmlformats.org/drawingml/2006/picture">
+                  <pic:nvPicPr>
+                    <pic:cNvPr id="0" name="" descr=""/>
+                    <pic:cNvPicPr>
+                      <a:picLocks noChangeAspect="1" noChangeArrowheads="1"/>
+                    </pic:cNvPicPr>
+                  </pic:nvPicPr>
+                  <pic:blipFill>
+                    <a:blip r:embed="rId9" cstate="none"/>
+                    <a:srcRect/>
+                    <a:stretch>
+                      <a:fillRect/>
+                    </a:stretch>
+                  </pic:blipFill>
+                  <pic:spPr bwMode="auto">
+                    <a:xfrm>
+                      <a:off x="0" y="0"/>
+                      <a:ext cx="4657725" cy="3429000"/>
+                    </a:xfrm>
+                    <a:prstGeom prst="rect">
+                      <a:avLst/>
+                    </a:prstGeom>
+                  </pic:spPr>
+                </pic:pic>
+              </a:graphicData>
+            </a:graphic>
+          </wp:inline>
+        </w:drawing>
+      </w:r>
+    </w:p>
     <w:p>
       <w:r>
         <w:br w:type="page"/>
@@ -412,78 +334,52 @@
         <w:t xml:space="preserve">Created an empty public GitHub repository named Assignment01 (no README/.gitignore/license). Added GitHub as a second remote (github) on the same local repository used in Task 1 and verified both remotes with git remote -v, confirming no token or password appears in either URL.</w:t>
       </w:r>
     </w:p>
-    <w:tbl>
-      <w:tblPr>
-        <w:tblW w:type="dxa" w:w="9350"/>
-        <w:tblBorders>
-          <w:top w:val="single" w:color="auto" w:sz="4"/>
-          <w:left w:val="single" w:color="auto" w:sz="4"/>
-          <w:bottom w:val="single" w:color="auto" w:sz="4"/>
-          <w:right w:val="single" w:color="auto" w:sz="4"/>
-          <w:insideH w:val="single" w:color="auto" w:sz="4"/>
-          <w:insideV w:val="single" w:color="auto" w:sz="4"/>
-        </w:tblBorders>
-      </w:tblPr>
-      <w:tblGrid>
-        <w:gridCol w:w="9350"/>
-      </w:tblGrid>
-      <w:tr>
-        <w:tc>
-          <w:tcPr>
-            <w:tcW w:type="dxa" w:w="9350"/>
-            <w:tcBorders>
-              <w:top w:val="single" w:color="BF9000" w:sz="6"/>
-              <w:left w:val="single" w:color="BF9000" w:sz="6"/>
-              <w:bottom w:val="single" w:color="BF9000" w:sz="6"/>
-              <w:right w:val="single" w:color="BF9000" w:sz="6"/>
-            </w:tcBorders>
-            <w:shd w:fill="FFF2CC" w:val="clear"/>
-            <w:tcMar>
-              <w:top w:type="dxa" w:w="150"/>
-              <w:left w:type="dxa" w:w="150"/>
-              <w:bottom w:type="dxa" w:w="150"/>
-              <w:right w:type="dxa" w:w="150"/>
-            </w:tcMar>
-          </w:tcPr>
-          <w:p>
-            <w:pPr>
-              <w:spacing w:after="60"/>
-            </w:pPr>
-            <w:r>
-              <w:rPr>
-                <w:b/>
-                <w:bCs/>
-                <w:color w:val="BF9000"/>
-              </w:rPr>
-              <w:t xml:space="preserve">SCREENSHOT PENDING</w:t>
-            </w:r>
-          </w:p>
-          <w:p>
-            <w:pPr>
-              <w:spacing w:after="60"/>
-            </w:pPr>
-            <w:r>
-              <w:rPr>
-                <w:b/>
-                <w:bCs/>
-                <w:i/>
-                <w:iCs/>
-              </w:rPr>
-              <w:t xml:space="preserve">File: task2_remotes.png</w:t>
-            </w:r>
-          </w:p>
-          <w:p>
-            <w:r>
-              <w:rPr>
-                <w:i/>
-                <w:iCs/>
-              </w:rPr>
-              <w:t xml:space="preserve">Must show: output of git remote -v listing both gitea and github remotes with fetch/push URLs, no credentials visible.</w:t>
-            </w:r>
-          </w:p>
-        </w:tc>
-      </w:tr>
-    </w:tbl>
+    <w:p>
+      <w:pPr>
+        <w:spacing w:after="100"/>
+        <w:jc w:val="center"/>
+      </w:pPr>
+      <w:r>
+        <w:drawing>
+          <wp:inline distT="0" distB="0" distL="0" distR="0">
+            <wp:extent cx="5019675" cy="3429000"/>
+            <wp:effectExtent t="0" r="0" b="0" l="0"/>
+            <wp:docPr id="4" name="" descr="" title=""/>
+            <wp:cNvGraphicFramePr>
+              <a:graphicFrameLocks xmlns:a="http://schemas.openxmlformats.org/drawingml/2006/main" noChangeAspect="1"/>
+            </wp:cNvGraphicFramePr>
+            <a:graphic xmlns:a="http://schemas.openxmlformats.org/drawingml/2006/main">
+              <a:graphicData uri="http://schemas.openxmlformats.org/drawingml/2006/picture">
+                <pic:pic xmlns:pic="http://schemas.openxmlformats.org/drawingml/2006/picture">
+                  <pic:nvPicPr>
+                    <pic:cNvPr id="0" name="" descr=""/>
+                    <pic:cNvPicPr>
+                      <a:picLocks noChangeAspect="1" noChangeArrowheads="1"/>
+                    </pic:cNvPicPr>
+                  </pic:nvPicPr>
+                  <pic:blipFill>
+                    <a:blip r:embed="rId10" cstate="none"/>
+                    <a:srcRect/>
+                    <a:stretch>
+                      <a:fillRect/>
+                    </a:stretch>
+                  </pic:blipFill>
+                  <pic:spPr bwMode="auto">
+                    <a:xfrm>
+                      <a:off x="0" y="0"/>
+                      <a:ext cx="5019675" cy="3429000"/>
+                    </a:xfrm>
+                    <a:prstGeom prst="rect">
+                      <a:avLst/>
+                    </a:prstGeom>
+                  </pic:spPr>
+                </pic:pic>
+              </a:graphicData>
+            </a:graphic>
+          </wp:inline>
+        </w:drawing>
+      </w:r>
+    </w:p>
     <w:p>
       <w:pPr>
         <w:spacing w:after="200"/>
@@ -506,78 +402,52 @@
         <w:t xml:space="preserve">Pushed the main branch to the github remote.</w:t>
       </w:r>
     </w:p>
-    <w:tbl>
-      <w:tblPr>
-        <w:tblW w:type="dxa" w:w="9350"/>
-        <w:tblBorders>
-          <w:top w:val="single" w:color="auto" w:sz="4"/>
-          <w:left w:val="single" w:color="auto" w:sz="4"/>
-          <w:bottom w:val="single" w:color="auto" w:sz="4"/>
-          <w:right w:val="single" w:color="auto" w:sz="4"/>
-          <w:insideH w:val="single" w:color="auto" w:sz="4"/>
-          <w:insideV w:val="single" w:color="auto" w:sz="4"/>
-        </w:tblBorders>
-      </w:tblPr>
-      <w:tblGrid>
-        <w:gridCol w:w="9350"/>
-      </w:tblGrid>
-      <w:tr>
-        <w:tc>
-          <w:tcPr>
-            <w:tcW w:type="dxa" w:w="9350"/>
-            <w:tcBorders>
-              <w:top w:val="single" w:color="BF9000" w:sz="6"/>
-              <w:left w:val="single" w:color="BF9000" w:sz="6"/>
-              <w:bottom w:val="single" w:color="BF9000" w:sz="6"/>
-              <w:right w:val="single" w:color="BF9000" w:sz="6"/>
-            </w:tcBorders>
-            <w:shd w:fill="FFF2CC" w:val="clear"/>
-            <w:tcMar>
-              <w:top w:type="dxa" w:w="150"/>
-              <w:left w:type="dxa" w:w="150"/>
-              <w:bottom w:type="dxa" w:w="150"/>
-              <w:right w:type="dxa" w:w="150"/>
-            </w:tcMar>
-          </w:tcPr>
-          <w:p>
-            <w:pPr>
-              <w:spacing w:after="60"/>
-            </w:pPr>
-            <w:r>
-              <w:rPr>
-                <w:b/>
-                <w:bCs/>
-                <w:color w:val="BF9000"/>
-              </w:rPr>
-              <w:t xml:space="preserve">SCREENSHOT PENDING</w:t>
-            </w:r>
-          </w:p>
-          <w:p>
-            <w:pPr>
-              <w:spacing w:after="60"/>
-            </w:pPr>
-            <w:r>
-              <w:rPr>
-                <w:b/>
-                <w:bCs/>
-                <w:i/>
-                <w:iCs/>
-              </w:rPr>
-              <w:t xml:space="preserve">File: task2_github_push.png</w:t>
-            </w:r>
-          </w:p>
-          <w:p>
-            <w:r>
-              <w:rPr>
-                <w:i/>
-                <w:iCs/>
-              </w:rPr>
-              <w:t xml:space="preserve">Must show: the git push command, the github remote, a successful result, and the &lt;github-username&gt;@ubuntu prompt.</w:t>
-            </w:r>
-          </w:p>
-        </w:tc>
-      </w:tr>
-    </w:tbl>
+    <w:p>
+      <w:pPr>
+        <w:spacing w:after="100"/>
+        <w:jc w:val="center"/>
+      </w:pPr>
+      <w:r>
+        <w:drawing>
+          <wp:inline distT="0" distB="0" distL="0" distR="0">
+            <wp:extent cx="5334000" cy="2676525"/>
+            <wp:effectExtent t="0" r="0" b="0" l="0"/>
+            <wp:docPr id="5" name="" descr="" title=""/>
+            <wp:cNvGraphicFramePr>
+              <a:graphicFrameLocks xmlns:a="http://schemas.openxmlformats.org/drawingml/2006/main" noChangeAspect="1"/>
+            </wp:cNvGraphicFramePr>
+            <a:graphic xmlns:a="http://schemas.openxmlformats.org/drawingml/2006/main">
+              <a:graphicData uri="http://schemas.openxmlformats.org/drawingml/2006/picture">
+                <pic:pic xmlns:pic="http://schemas.openxmlformats.org/drawingml/2006/picture">
+                  <pic:nvPicPr>
+                    <pic:cNvPr id="0" name="" descr=""/>
+                    <pic:cNvPicPr>
+                      <a:picLocks noChangeAspect="1" noChangeArrowheads="1"/>
+                    </pic:cNvPicPr>
+                  </pic:nvPicPr>
+                  <pic:blipFill>
+                    <a:blip r:embed="rId11" cstate="none"/>
+                    <a:srcRect/>
+                    <a:stretch>
+                      <a:fillRect/>
+                    </a:stretch>
+                  </pic:blipFill>
+                  <pic:spPr bwMode="auto">
+                    <a:xfrm>
+                      <a:off x="0" y="0"/>
+                      <a:ext cx="5334000" cy="2676525"/>
+                    </a:xfrm>
+                    <a:prstGeom prst="rect">
+                      <a:avLst/>
+                    </a:prstGeom>
+                  </pic:spPr>
+                </pic:pic>
+              </a:graphicData>
+            </a:graphic>
+          </wp:inline>
+        </w:drawing>
+      </w:r>
+    </w:p>
     <w:p>
       <w:pPr>
         <w:spacing w:after="200"/>
@@ -600,78 +470,52 @@
         <w:t xml:space="preserve">Opened https://github.com/&lt;my-github-username&gt;/Assignment01 and confirmed the repository owner is my GitHub account, the repository name is Assignment01, the repository is public, and the rendered README shows my full name and registration number.</w:t>
       </w:r>
     </w:p>
-    <w:tbl>
-      <w:tblPr>
-        <w:tblW w:type="dxa" w:w="9350"/>
-        <w:tblBorders>
-          <w:top w:val="single" w:color="auto" w:sz="4"/>
-          <w:left w:val="single" w:color="auto" w:sz="4"/>
-          <w:bottom w:val="single" w:color="auto" w:sz="4"/>
-          <w:right w:val="single" w:color="auto" w:sz="4"/>
-          <w:insideH w:val="single" w:color="auto" w:sz="4"/>
-          <w:insideV w:val="single" w:color="auto" w:sz="4"/>
-        </w:tblBorders>
-      </w:tblPr>
-      <w:tblGrid>
-        <w:gridCol w:w="9350"/>
-      </w:tblGrid>
-      <w:tr>
-        <w:tc>
-          <w:tcPr>
-            <w:tcW w:type="dxa" w:w="9350"/>
-            <w:tcBorders>
-              <w:top w:val="single" w:color="BF9000" w:sz="6"/>
-              <w:left w:val="single" w:color="BF9000" w:sz="6"/>
-              <w:bottom w:val="single" w:color="BF9000" w:sz="6"/>
-              <w:right w:val="single" w:color="BF9000" w:sz="6"/>
-            </w:tcBorders>
-            <w:shd w:fill="FFF2CC" w:val="clear"/>
-            <w:tcMar>
-              <w:top w:type="dxa" w:w="150"/>
-              <w:left w:type="dxa" w:w="150"/>
-              <w:bottom w:type="dxa" w:w="150"/>
-              <w:right w:type="dxa" w:w="150"/>
-            </w:tcMar>
-          </w:tcPr>
-          <w:p>
-            <w:pPr>
-              <w:spacing w:after="60"/>
-            </w:pPr>
-            <w:r>
-              <w:rPr>
-                <w:b/>
-                <w:bCs/>
-                <w:color w:val="BF9000"/>
-              </w:rPr>
-              <w:t xml:space="preserve">SCREENSHOT PENDING</w:t>
-            </w:r>
-          </w:p>
-          <w:p>
-            <w:pPr>
-              <w:spacing w:after="60"/>
-            </w:pPr>
-            <w:r>
-              <w:rPr>
-                <w:b/>
-                <w:bCs/>
-                <w:i/>
-                <w:iCs/>
-              </w:rPr>
-              <w:t xml:space="preserve">File: task2_github_repository.png</w:t>
-            </w:r>
-          </w:p>
-          <w:p>
-            <w:r>
-              <w:rPr>
-                <w:i/>
-                <w:iCs/>
-              </w:rPr>
-              <w:t xml:space="preserve">Must show: repository owner, repository name, public status, and rendered README visible on GitHub.</w:t>
-            </w:r>
-          </w:p>
-        </w:tc>
-      </w:tr>
-    </w:tbl>
+    <w:p>
+      <w:pPr>
+        <w:spacing w:after="100"/>
+        <w:jc w:val="center"/>
+      </w:pPr>
+      <w:r>
+        <w:drawing>
+          <wp:inline distT="0" distB="0" distL="0" distR="0">
+            <wp:extent cx="5334000" cy="2695575"/>
+            <wp:effectExtent t="0" r="0" b="0" l="0"/>
+            <wp:docPr id="6" name="" descr="" title=""/>
+            <wp:cNvGraphicFramePr>
+              <a:graphicFrameLocks xmlns:a="http://schemas.openxmlformats.org/drawingml/2006/main" noChangeAspect="1"/>
+            </wp:cNvGraphicFramePr>
+            <a:graphic xmlns:a="http://schemas.openxmlformats.org/drawingml/2006/main">
+              <a:graphicData uri="http://schemas.openxmlformats.org/drawingml/2006/picture">
+                <pic:pic xmlns:pic="http://schemas.openxmlformats.org/drawingml/2006/picture">
+                  <pic:nvPicPr>
+                    <pic:cNvPr id="0" name="" descr=""/>
+                    <pic:cNvPicPr>
+                      <a:picLocks noChangeAspect="1" noChangeArrowheads="1"/>
+                    </pic:cNvPicPr>
+                  </pic:nvPicPr>
+                  <pic:blipFill>
+                    <a:blip r:embed="rId12" cstate="none"/>
+                    <a:srcRect/>
+                    <a:stretch>
+                      <a:fillRect/>
+                    </a:stretch>
+                  </pic:blipFill>
+                  <pic:spPr bwMode="auto">
+                    <a:xfrm>
+                      <a:off x="0" y="0"/>
+                      <a:ext cx="5334000" cy="2695575"/>
+                    </a:xfrm>
+                    <a:prstGeom prst="rect">
+                      <a:avLst/>
+                    </a:prstGeom>
+                  </pic:spPr>
+                </pic:pic>
+              </a:graphicData>
+            </a:graphic>
+          </wp:inline>
+        </w:drawing>
+      </w:r>
+    </w:p>
     <w:p>
       <w:r>
         <w:br w:type="page"/>
@@ -994,78 +838,52 @@
         <w:t xml:space="preserve">Created a public GitHub repository named &lt;my-github-username&gt;.github.io containing index.html and styles.css, with About Me, Education, Skills, and Projects sections. Committed and pushed the source files to the main branch.</w:t>
       </w:r>
     </w:p>
-    <w:tbl>
-      <w:tblPr>
-        <w:tblW w:type="dxa" w:w="9350"/>
-        <w:tblBorders>
-          <w:top w:val="single" w:color="auto" w:sz="4"/>
-          <w:left w:val="single" w:color="auto" w:sz="4"/>
-          <w:bottom w:val="single" w:color="auto" w:sz="4"/>
-          <w:right w:val="single" w:color="auto" w:sz="4"/>
-          <w:insideH w:val="single" w:color="auto" w:sz="4"/>
-          <w:insideV w:val="single" w:color="auto" w:sz="4"/>
-        </w:tblBorders>
-      </w:tblPr>
-      <w:tblGrid>
-        <w:gridCol w:w="9350"/>
-      </w:tblGrid>
-      <w:tr>
-        <w:tc>
-          <w:tcPr>
-            <w:tcW w:type="dxa" w:w="9350"/>
-            <w:tcBorders>
-              <w:top w:val="single" w:color="BF9000" w:sz="6"/>
-              <w:left w:val="single" w:color="BF9000" w:sz="6"/>
-              <w:bottom w:val="single" w:color="BF9000" w:sz="6"/>
-              <w:right w:val="single" w:color="BF9000" w:sz="6"/>
-            </w:tcBorders>
-            <w:shd w:fill="FFF2CC" w:val="clear"/>
-            <w:tcMar>
-              <w:top w:type="dxa" w:w="150"/>
-              <w:left w:type="dxa" w:w="150"/>
-              <w:bottom w:type="dxa" w:w="150"/>
-              <w:right w:type="dxa" w:w="150"/>
-            </w:tcMar>
-          </w:tcPr>
-          <w:p>
-            <w:pPr>
-              <w:spacing w:after="60"/>
-            </w:pPr>
-            <w:r>
-              <w:rPr>
-                <w:b/>
-                <w:bCs/>
-                <w:color w:val="BF9000"/>
-              </w:rPr>
-              <w:t xml:space="preserve">SCREENSHOT PENDING</w:t>
-            </w:r>
-          </w:p>
-          <w:p>
-            <w:pPr>
-              <w:spacing w:after="60"/>
-            </w:pPr>
-            <w:r>
-              <w:rPr>
-                <w:b/>
-                <w:bCs/>
-                <w:i/>
-                <w:iCs/>
-              </w:rPr>
-              <w:t xml:space="preserve">File: task4_pages_repository.png</w:t>
-            </w:r>
-          </w:p>
-          <w:p>
-            <w:r>
-              <w:rPr>
-                <w:i/>
-                <w:iCs/>
-              </w:rPr>
-              <w:t xml:space="preserve">Must show: repository owner, repository name, and both index.html and styles.css visible in the file listing.</w:t>
-            </w:r>
-          </w:p>
-        </w:tc>
-      </w:tr>
-    </w:tbl>
+    <w:p>
+      <w:pPr>
+        <w:spacing w:after="100"/>
+        <w:jc w:val="center"/>
+      </w:pPr>
+      <w:r>
+        <w:drawing>
+          <wp:inline distT="0" distB="0" distL="0" distR="0">
+            <wp:extent cx="5334000" cy="2676525"/>
+            <wp:effectExtent t="0" r="0" b="0" l="0"/>
+            <wp:docPr id="7" name="" descr="" title=""/>
+            <wp:cNvGraphicFramePr>
+              <a:graphicFrameLocks xmlns:a="http://schemas.openxmlformats.org/drawingml/2006/main" noChangeAspect="1"/>
+            </wp:cNvGraphicFramePr>
+            <a:graphic xmlns:a="http://schemas.openxmlformats.org/drawingml/2006/main">
+              <a:graphicData uri="http://schemas.openxmlformats.org/drawingml/2006/picture">
+                <pic:pic xmlns:pic="http://schemas.openxmlformats.org/drawingml/2006/picture">
+                  <pic:nvPicPr>
+                    <pic:cNvPr id="0" name="" descr=""/>
+                    <pic:cNvPicPr>
+                      <a:picLocks noChangeAspect="1" noChangeArrowheads="1"/>
+                    </pic:cNvPicPr>
+                  </pic:nvPicPr>
+                  <pic:blipFill>
+                    <a:blip r:embed="rId13" cstate="none"/>
+                    <a:srcRect/>
+                    <a:stretch>
+                      <a:fillRect/>
+                    </a:stretch>
+                  </pic:blipFill>
+                  <pic:spPr bwMode="auto">
+                    <a:xfrm>
+                      <a:off x="0" y="0"/>
+                      <a:ext cx="5334000" cy="2676525"/>
+                    </a:xfrm>
+                    <a:prstGeom prst="rect">
+                      <a:avLst/>
+                    </a:prstGeom>
+                  </pic:spPr>
+                </pic:pic>
+              </a:graphicData>
+            </a:graphic>
+          </wp:inline>
+        </w:drawing>
+      </w:r>
+    </w:p>
     <w:p>
       <w:pPr>
         <w:spacing w:after="200"/>
@@ -1088,78 +906,52 @@
         <w:t xml:space="preserve">In repository Settings &gt; Pages, selected Deploy from a branch, chose the main branch and /(root) folder, saved, and waited for GitHub to report the site as published/live.</w:t>
       </w:r>
     </w:p>
-    <w:tbl>
-      <w:tblPr>
-        <w:tblW w:type="dxa" w:w="9350"/>
-        <w:tblBorders>
-          <w:top w:val="single" w:color="auto" w:sz="4"/>
-          <w:left w:val="single" w:color="auto" w:sz="4"/>
-          <w:bottom w:val="single" w:color="auto" w:sz="4"/>
-          <w:right w:val="single" w:color="auto" w:sz="4"/>
-          <w:insideH w:val="single" w:color="auto" w:sz="4"/>
-          <w:insideV w:val="single" w:color="auto" w:sz="4"/>
-        </w:tblBorders>
-      </w:tblPr>
-      <w:tblGrid>
-        <w:gridCol w:w="9350"/>
-      </w:tblGrid>
-      <w:tr>
-        <w:tc>
-          <w:tcPr>
-            <w:tcW w:type="dxa" w:w="9350"/>
-            <w:tcBorders>
-              <w:top w:val="single" w:color="BF9000" w:sz="6"/>
-              <w:left w:val="single" w:color="BF9000" w:sz="6"/>
-              <w:bottom w:val="single" w:color="BF9000" w:sz="6"/>
-              <w:right w:val="single" w:color="BF9000" w:sz="6"/>
-            </w:tcBorders>
-            <w:shd w:fill="FFF2CC" w:val="clear"/>
-            <w:tcMar>
-              <w:top w:type="dxa" w:w="150"/>
-              <w:left w:type="dxa" w:w="150"/>
-              <w:bottom w:type="dxa" w:w="150"/>
-              <w:right w:type="dxa" w:w="150"/>
-            </w:tcMar>
-          </w:tcPr>
-          <w:p>
-            <w:pPr>
-              <w:spacing w:after="60"/>
-            </w:pPr>
-            <w:r>
-              <w:rPr>
-                <w:b/>
-                <w:bCs/>
-                <w:color w:val="BF9000"/>
-              </w:rPr>
-              <w:t xml:space="preserve">SCREENSHOT PENDING</w:t>
-            </w:r>
-          </w:p>
-          <w:p>
-            <w:pPr>
-              <w:spacing w:after="60"/>
-            </w:pPr>
-            <w:r>
-              <w:rPr>
-                <w:b/>
-                <w:bCs/>
-                <w:i/>
-                <w:iCs/>
-              </w:rPr>
-              <w:t xml:space="preserve">File: task4_pages_deployment.png</w:t>
-            </w:r>
-          </w:p>
-          <w:p>
-            <w:r>
-              <w:rPr>
-                <w:i/>
-                <w:iCs/>
-              </w:rPr>
-              <w:t xml:space="preserve">Must show: the GitHub Pages settings page with a successful published/live status and the &lt;username&gt;.github.io URL.</w:t>
-            </w:r>
-          </w:p>
-        </w:tc>
-      </w:tr>
-    </w:tbl>
+    <w:p>
+      <w:pPr>
+        <w:spacing w:after="100"/>
+        <w:jc w:val="center"/>
+      </w:pPr>
+      <w:r>
+        <w:drawing>
+          <wp:inline distT="0" distB="0" distL="0" distR="0">
+            <wp:extent cx="5334000" cy="2667000"/>
+            <wp:effectExtent t="0" r="0" b="0" l="0"/>
+            <wp:docPr id="8" name="" descr="" title=""/>
+            <wp:cNvGraphicFramePr>
+              <a:graphicFrameLocks xmlns:a="http://schemas.openxmlformats.org/drawingml/2006/main" noChangeAspect="1"/>
+            </wp:cNvGraphicFramePr>
+            <a:graphic xmlns:a="http://schemas.openxmlformats.org/drawingml/2006/main">
+              <a:graphicData uri="http://schemas.openxmlformats.org/drawingml/2006/picture">
+                <pic:pic xmlns:pic="http://schemas.openxmlformats.org/drawingml/2006/picture">
+                  <pic:nvPicPr>
+                    <pic:cNvPr id="0" name="" descr=""/>
+                    <pic:cNvPicPr>
+                      <a:picLocks noChangeAspect="1" noChangeArrowheads="1"/>
+                    </pic:cNvPicPr>
+                  </pic:nvPicPr>
+                  <pic:blipFill>
+                    <a:blip r:embed="rId14" cstate="none"/>
+                    <a:srcRect/>
+                    <a:stretch>
+                      <a:fillRect/>
+                    </a:stretch>
+                  </pic:blipFill>
+                  <pic:spPr bwMode="auto">
+                    <a:xfrm>
+                      <a:off x="0" y="0"/>
+                      <a:ext cx="5334000" cy="2667000"/>
+                    </a:xfrm>
+                    <a:prstGeom prst="rect">
+                      <a:avLst/>
+                    </a:prstGeom>
+                  </pic:spPr>
+                </pic:pic>
+              </a:graphicData>
+            </a:graphic>
+          </wp:inline>
+        </w:drawing>
+      </w:r>
+    </w:p>
     <w:p>
       <w:pPr>
         <w:spacing w:after="200"/>
@@ -1182,78 +974,52 @@
         <w:t xml:space="preserve">Opened https://&lt;my-github-username&gt;.github.io/ and confirmed the site loads successfully with the portfolio content visible.</w:t>
       </w:r>
     </w:p>
-    <w:tbl>
-      <w:tblPr>
-        <w:tblW w:type="dxa" w:w="9350"/>
-        <w:tblBorders>
-          <w:top w:val="single" w:color="auto" w:sz="4"/>
-          <w:left w:val="single" w:color="auto" w:sz="4"/>
-          <w:bottom w:val="single" w:color="auto" w:sz="4"/>
-          <w:right w:val="single" w:color="auto" w:sz="4"/>
-          <w:insideH w:val="single" w:color="auto" w:sz="4"/>
-          <w:insideV w:val="single" w:color="auto" w:sz="4"/>
-        </w:tblBorders>
-      </w:tblPr>
-      <w:tblGrid>
-        <w:gridCol w:w="9350"/>
-      </w:tblGrid>
-      <w:tr>
-        <w:tc>
-          <w:tcPr>
-            <w:tcW w:type="dxa" w:w="9350"/>
-            <w:tcBorders>
-              <w:top w:val="single" w:color="BF9000" w:sz="6"/>
-              <w:left w:val="single" w:color="BF9000" w:sz="6"/>
-              <w:bottom w:val="single" w:color="BF9000" w:sz="6"/>
-              <w:right w:val="single" w:color="BF9000" w:sz="6"/>
-            </w:tcBorders>
-            <w:shd w:fill="FFF2CC" w:val="clear"/>
-            <w:tcMar>
-              <w:top w:type="dxa" w:w="150"/>
-              <w:left w:type="dxa" w:w="150"/>
-              <w:bottom w:type="dxa" w:w="150"/>
-              <w:right w:type="dxa" w:w="150"/>
-            </w:tcMar>
-          </w:tcPr>
-          <w:p>
-            <w:pPr>
-              <w:spacing w:after="60"/>
-            </w:pPr>
-            <w:r>
-              <w:rPr>
-                <w:b/>
-                <w:bCs/>
-                <w:color w:val="BF9000"/>
-              </w:rPr>
-              <w:t xml:space="preserve">SCREENSHOT PENDING</w:t>
-            </w:r>
-          </w:p>
-          <w:p>
-            <w:pPr>
-              <w:spacing w:after="60"/>
-            </w:pPr>
-            <w:r>
-              <w:rPr>
-                <w:b/>
-                <w:bCs/>
-                <w:i/>
-                <w:iCs/>
-              </w:rPr>
-              <w:t xml:space="preserve">File: task4_portfolio_live.png</w:t>
-            </w:r>
-          </w:p>
-          <w:p>
-            <w:r>
-              <w:rPr>
-                <w:i/>
-                <w:iCs/>
-              </w:rPr>
-              <w:t xml:space="preserve">Must show: the complete github.io URL in the address bar and at least one required section (About Me, Education, Skills, or Projects).</w:t>
-            </w:r>
-          </w:p>
-        </w:tc>
-      </w:tr>
-    </w:tbl>
+    <w:p>
+      <w:pPr>
+        <w:spacing w:after="100"/>
+        <w:jc w:val="center"/>
+      </w:pPr>
+      <w:r>
+        <w:drawing>
+          <wp:inline distT="0" distB="0" distL="0" distR="0">
+            <wp:extent cx="5334000" cy="3000375"/>
+            <wp:effectExtent t="0" r="0" b="0" l="0"/>
+            <wp:docPr id="9" name="" descr="" title=""/>
+            <wp:cNvGraphicFramePr>
+              <a:graphicFrameLocks xmlns:a="http://schemas.openxmlformats.org/drawingml/2006/main" noChangeAspect="1"/>
+            </wp:cNvGraphicFramePr>
+            <a:graphic xmlns:a="http://schemas.openxmlformats.org/drawingml/2006/main">
+              <a:graphicData uri="http://schemas.openxmlformats.org/drawingml/2006/picture">
+                <pic:pic xmlns:pic="http://schemas.openxmlformats.org/drawingml/2006/picture">
+                  <pic:nvPicPr>
+                    <pic:cNvPr id="0" name="" descr=""/>
+                    <pic:cNvPicPr>
+                      <a:picLocks noChangeAspect="1" noChangeArrowheads="1"/>
+                    </pic:cNvPicPr>
+                  </pic:nvPicPr>
+                  <pic:blipFill>
+                    <a:blip r:embed="rId15" cstate="none"/>
+                    <a:srcRect/>
+                    <a:stretch>
+                      <a:fillRect/>
+                    </a:stretch>
+                  </pic:blipFill>
+                  <pic:spPr bwMode="auto">
+                    <a:xfrm>
+                      <a:off x="0" y="0"/>
+                      <a:ext cx="5334000" cy="3000375"/>
+                    </a:xfrm>
+                    <a:prstGeom prst="rect">
+                      <a:avLst/>
+                    </a:prstGeom>
+                  </pic:spPr>
+                </pic:pic>
+              </a:graphicData>
+            </a:graphic>
+          </wp:inline>
+        </w:drawing>
+      </w:r>
+    </w:p>
     <w:p>
       <w:r>
         <w:br w:type="page"/>
@@ -1365,7 +1131,7 @@
         <w:spacing w:after="150"/>
       </w:pPr>
       <w:r>
-        <w:t xml:space="preserve">Gitea repository: TBD</w:t>
+        <w:t xml:space="preserve">Gitea repository: http://192.168.148.128:3000/maleehanadeem13/Assignment01</w:t>
       </w:r>
     </w:p>
     <w:p>
@@ -1373,7 +1139,7 @@
         <w:spacing w:after="150"/>
       </w:pPr>
       <w:r>
-        <w:t xml:space="preserve">GitHub Assignment01 repository: TBD</w:t>
+        <w:t xml:space="preserve">GitHub Assignment01 repository: https://github.com/maleehanadeem13/Assignment01</w:t>
       </w:r>
     </w:p>
     <w:p>
@@ -1381,7 +1147,7 @@
         <w:spacing w:after="150"/>
       </w:pPr>
       <w:r>
-        <w:t xml:space="preserve">Portfolio (GitHub Pages): TBD</w:t>
+        <w:t xml:space="preserve">Portfolio (GitHub Pages): https://maleehanadeem13.github.io/</w:t>
       </w:r>
     </w:p>
     <w:p>

</xml_diff>

<commit_message>
Embed final Task 3 screenshots; all 12 screenshots now in solution docx/pdf
</commit_message>
<xml_diff>
--- a/Assignments/Assignment01/Assignment01_Solution.docx
+++ b/Assignments/Assignment01/Assignment01_Solution.docx
@@ -547,297 +547,6 @@
         <w:t xml:space="preserve">Initialized Git LFS, confirmed its version, and configured tracking for *.bin files. Verified the resulting rule in .gitattributes.</w:t>
       </w:r>
     </w:p>
-    <w:tbl>
-      <w:tblPr>
-        <w:tblW w:type="dxa" w:w="9350"/>
-        <w:tblBorders>
-          <w:top w:val="single" w:color="auto" w:sz="4"/>
-          <w:left w:val="single" w:color="auto" w:sz="4"/>
-          <w:bottom w:val="single" w:color="auto" w:sz="4"/>
-          <w:right w:val="single" w:color="auto" w:sz="4"/>
-          <w:insideH w:val="single" w:color="auto" w:sz="4"/>
-          <w:insideV w:val="single" w:color="auto" w:sz="4"/>
-        </w:tblBorders>
-      </w:tblPr>
-      <w:tblGrid>
-        <w:gridCol w:w="9350"/>
-      </w:tblGrid>
-      <w:tr>
-        <w:tc>
-          <w:tcPr>
-            <w:tcW w:type="dxa" w:w="9350"/>
-            <w:tcBorders>
-              <w:top w:val="single" w:color="BF9000" w:sz="6"/>
-              <w:left w:val="single" w:color="BF9000" w:sz="6"/>
-              <w:bottom w:val="single" w:color="BF9000" w:sz="6"/>
-              <w:right w:val="single" w:color="BF9000" w:sz="6"/>
-            </w:tcBorders>
-            <w:shd w:fill="FFF2CC" w:val="clear"/>
-            <w:tcMar>
-              <w:top w:type="dxa" w:w="150"/>
-              <w:left w:type="dxa" w:w="150"/>
-              <w:bottom w:type="dxa" w:w="150"/>
-              <w:right w:type="dxa" w:w="150"/>
-            </w:tcMar>
-          </w:tcPr>
-          <w:p>
-            <w:pPr>
-              <w:spacing w:after="60"/>
-            </w:pPr>
-            <w:r>
-              <w:rPr>
-                <w:b/>
-                <w:bCs/>
-                <w:color w:val="BF9000"/>
-              </w:rPr>
-              <w:t xml:space="preserve">SCREENSHOT PENDING</w:t>
-            </w:r>
-          </w:p>
-          <w:p>
-            <w:pPr>
-              <w:spacing w:after="60"/>
-            </w:pPr>
-            <w:r>
-              <w:rPr>
-                <w:b/>
-                <w:bCs/>
-                <w:i/>
-                <w:iCs/>
-              </w:rPr>
-              <w:t xml:space="preserve">File: task3_lfs_setup.png</w:t>
-            </w:r>
-          </w:p>
-          <w:p>
-            <w:r>
-              <w:rPr>
-                <w:i/>
-                <w:iCs/>
-              </w:rPr>
-              <w:t xml:space="preserve">Must show: successful git lfs install, the git lfs version, the git lfs track "*.bin" command, and the *.bin rule in .gitattributes.</w:t>
-            </w:r>
-          </w:p>
-        </w:tc>
-      </w:tr>
-    </w:tbl>
-    <w:p>
-      <w:pPr>
-        <w:spacing w:after="200"/>
-      </w:pPr>
-    </w:p>
-    <w:p>
-      <w:pPr>
-        <w:pStyle w:val="Heading2"/>
-        <w:spacing w:after="150" w:before="300"/>
-      </w:pPr>
-      <w:r>
-        <w:t xml:space="preserve">Step 3.2: Create and Verify Three LFS Files</w:t>
-      </w:r>
-    </w:p>
-    <w:p>
-      <w:pPr>
-        <w:spacing w:after="150"/>
-      </w:pPr>
-      <w:r>
-        <w:t xml:space="preserve">Created three files each larger than 100 MiB (large-file-1.bin, large-file-2.bin, large-file-3.bin) using truncate, staged .gitattributes and the three files, and verified they are tracked by Git LFS with their sizes.</w:t>
-      </w:r>
-    </w:p>
-    <w:tbl>
-      <w:tblPr>
-        <w:tblW w:type="dxa" w:w="9350"/>
-        <w:tblBorders>
-          <w:top w:val="single" w:color="auto" w:sz="4"/>
-          <w:left w:val="single" w:color="auto" w:sz="4"/>
-          <w:bottom w:val="single" w:color="auto" w:sz="4"/>
-          <w:right w:val="single" w:color="auto" w:sz="4"/>
-          <w:insideH w:val="single" w:color="auto" w:sz="4"/>
-          <w:insideV w:val="single" w:color="auto" w:sz="4"/>
-        </w:tblBorders>
-      </w:tblPr>
-      <w:tblGrid>
-        <w:gridCol w:w="9350"/>
-      </w:tblGrid>
-      <w:tr>
-        <w:tc>
-          <w:tcPr>
-            <w:tcW w:type="dxa" w:w="9350"/>
-            <w:tcBorders>
-              <w:top w:val="single" w:color="BF9000" w:sz="6"/>
-              <w:left w:val="single" w:color="BF9000" w:sz="6"/>
-              <w:bottom w:val="single" w:color="BF9000" w:sz="6"/>
-              <w:right w:val="single" w:color="BF9000" w:sz="6"/>
-            </w:tcBorders>
-            <w:shd w:fill="FFF2CC" w:val="clear"/>
-            <w:tcMar>
-              <w:top w:type="dxa" w:w="150"/>
-              <w:left w:type="dxa" w:w="150"/>
-              <w:bottom w:type="dxa" w:w="150"/>
-              <w:right w:type="dxa" w:w="150"/>
-            </w:tcMar>
-          </w:tcPr>
-          <w:p>
-            <w:pPr>
-              <w:spacing w:after="60"/>
-            </w:pPr>
-            <w:r>
-              <w:rPr>
-                <w:b/>
-                <w:bCs/>
-                <w:color w:val="BF9000"/>
-              </w:rPr>
-              <w:t xml:space="preserve">SCREENSHOT PENDING</w:t>
-            </w:r>
-          </w:p>
-          <w:p>
-            <w:pPr>
-              <w:spacing w:after="60"/>
-            </w:pPr>
-            <w:r>
-              <w:rPr>
-                <w:b/>
-                <w:bCs/>
-                <w:i/>
-                <w:iCs/>
-              </w:rPr>
-              <w:t xml:space="preserve">File: task3_lfs_files.png</w:t>
-            </w:r>
-          </w:p>
-          <w:p>
-            <w:r>
-              <w:rPr>
-                <w:i/>
-                <w:iCs/>
-              </w:rPr>
-              <w:t xml:space="preserve">Must show: output of git lfs ls-files --size listing all three files, each larger than 100 MiB.</w:t>
-            </w:r>
-          </w:p>
-        </w:tc>
-      </w:tr>
-    </w:tbl>
-    <w:p>
-      <w:pPr>
-        <w:spacing w:after="200"/>
-      </w:pPr>
-    </w:p>
-    <w:p>
-      <w:pPr>
-        <w:pStyle w:val="Heading2"/>
-        <w:spacing w:after="150" w:before="300"/>
-      </w:pPr>
-      <w:r>
-        <w:t xml:space="preserve">Step 3.3: Commit and Push the LFS Files</w:t>
-      </w:r>
-    </w:p>
-    <w:p>
-      <w:pPr>
-        <w:spacing w:after="150"/>
-      </w:pPr>
-      <w:r>
-        <w:t xml:space="preserve">Committed the three LFS-tracked files and pushed them to the GitHub Assignment01 repository.</w:t>
-      </w:r>
-    </w:p>
-    <w:tbl>
-      <w:tblPr>
-        <w:tblW w:type="dxa" w:w="9350"/>
-        <w:tblBorders>
-          <w:top w:val="single" w:color="auto" w:sz="4"/>
-          <w:left w:val="single" w:color="auto" w:sz="4"/>
-          <w:bottom w:val="single" w:color="auto" w:sz="4"/>
-          <w:right w:val="single" w:color="auto" w:sz="4"/>
-          <w:insideH w:val="single" w:color="auto" w:sz="4"/>
-          <w:insideV w:val="single" w:color="auto" w:sz="4"/>
-        </w:tblBorders>
-      </w:tblPr>
-      <w:tblGrid>
-        <w:gridCol w:w="9350"/>
-      </w:tblGrid>
-      <w:tr>
-        <w:tc>
-          <w:tcPr>
-            <w:tcW w:type="dxa" w:w="9350"/>
-            <w:tcBorders>
-              <w:top w:val="single" w:color="BF9000" w:sz="6"/>
-              <w:left w:val="single" w:color="BF9000" w:sz="6"/>
-              <w:bottom w:val="single" w:color="BF9000" w:sz="6"/>
-              <w:right w:val="single" w:color="BF9000" w:sz="6"/>
-            </w:tcBorders>
-            <w:shd w:fill="FFF2CC" w:val="clear"/>
-            <w:tcMar>
-              <w:top w:type="dxa" w:w="150"/>
-              <w:left w:type="dxa" w:w="150"/>
-              <w:bottom w:type="dxa" w:w="150"/>
-              <w:right w:type="dxa" w:w="150"/>
-            </w:tcMar>
-          </w:tcPr>
-          <w:p>
-            <w:pPr>
-              <w:spacing w:after="60"/>
-            </w:pPr>
-            <w:r>
-              <w:rPr>
-                <w:b/>
-                <w:bCs/>
-                <w:color w:val="BF9000"/>
-              </w:rPr>
-              <w:t xml:space="preserve">SCREENSHOT PENDING</w:t>
-            </w:r>
-          </w:p>
-          <w:p>
-            <w:pPr>
-              <w:spacing w:after="60"/>
-            </w:pPr>
-            <w:r>
-              <w:rPr>
-                <w:b/>
-                <w:bCs/>
-                <w:i/>
-                <w:iCs/>
-              </w:rPr>
-              <w:t xml:space="preserve">File: task3_lfs_push.png</w:t>
-            </w:r>
-          </w:p>
-          <w:p>
-            <w:r>
-              <w:rPr>
-                <w:i/>
-                <w:iCs/>
-              </w:rPr>
-              <w:t xml:space="preserve">Must show: the LFS object upload completing successfully (ideally 100% (3/3)) during git push github main.</w:t>
-            </w:r>
-          </w:p>
-        </w:tc>
-      </w:tr>
-    </w:tbl>
-    <w:p>
-      <w:r>
-        <w:br w:type="page"/>
-      </w:r>
-    </w:p>
-    <w:p>
-      <w:pPr>
-        <w:pStyle w:val="Heading1"/>
-        <w:spacing w:after="200" w:before="400"/>
-      </w:pPr>
-      <w:r>
-        <w:t xml:space="preserve">Task 4: Create a Portfolio or CV with GitHub Pages</w:t>
-      </w:r>
-    </w:p>
-    <w:p>
-      <w:pPr>
-        <w:pStyle w:val="Heading2"/>
-        <w:spacing w:after="150" w:before="300"/>
-      </w:pPr>
-      <w:r>
-        <w:t xml:space="preserve">Step 4.1: Create and Push the Portfolio Repository</w:t>
-      </w:r>
-    </w:p>
-    <w:p>
-      <w:pPr>
-        <w:spacing w:after="150"/>
-      </w:pPr>
-      <w:r>
-        <w:t xml:space="preserve">Created a public GitHub repository named &lt;my-github-username&gt;.github.io containing index.html and styles.css, with About Me, Education, Skills, and Projects sections. Committed and pushed the source files to the main branch.</w:t>
-      </w:r>
-    </w:p>
     <w:p>
       <w:pPr>
         <w:spacing w:after="100"/>
@@ -846,7 +555,7 @@
       <w:r>
         <w:drawing>
           <wp:inline distT="0" distB="0" distL="0" distR="0">
-            <wp:extent cx="5334000" cy="2676525"/>
+            <wp:extent cx="4724400" cy="1771650"/>
             <wp:effectExtent t="0" r="0" b="0" l="0"/>
             <wp:docPr id="7" name="" descr="" title=""/>
             <wp:cNvGraphicFramePr>
@@ -871,7 +580,7 @@
                   <pic:spPr bwMode="auto">
                     <a:xfrm>
                       <a:off x="0" y="0"/>
-                      <a:ext cx="5334000" cy="2676525"/>
+                      <a:ext cx="4724400" cy="1771650"/>
                     </a:xfrm>
                     <a:prstGeom prst="rect">
                       <a:avLst/>
@@ -895,7 +604,7 @@
         <w:spacing w:after="150" w:before="300"/>
       </w:pPr>
       <w:r>
-        <w:t xml:space="preserve">Step 4.2: Publish with GitHub Pages</w:t>
+        <w:t xml:space="preserve">Step 3.2: Create and Verify Three LFS Files</w:t>
       </w:r>
     </w:p>
     <w:p>
@@ -903,7 +612,7 @@
         <w:spacing w:after="150"/>
       </w:pPr>
       <w:r>
-        <w:t xml:space="preserve">In repository Settings &gt; Pages, selected Deploy from a branch, chose the main branch and /(root) folder, saved, and waited for GitHub to report the site as published/live.</w:t>
+        <w:t xml:space="preserve">Created three files each larger than 100 MiB (large-file-1.bin, large-file-2.bin, large-file-3.bin) using truncate, staged .gitattributes and the three files, and verified they are tracked by Git LFS with their sizes.</w:t>
       </w:r>
     </w:p>
     <w:p>
@@ -914,7 +623,7 @@
       <w:r>
         <w:drawing>
           <wp:inline distT="0" distB="0" distL="0" distR="0">
-            <wp:extent cx="5334000" cy="2667000"/>
+            <wp:extent cx="5334000" cy="2847975"/>
             <wp:effectExtent t="0" r="0" b="0" l="0"/>
             <wp:docPr id="8" name="" descr="" title=""/>
             <wp:cNvGraphicFramePr>
@@ -939,7 +648,7 @@
                   <pic:spPr bwMode="auto">
                     <a:xfrm>
                       <a:off x="0" y="0"/>
-                      <a:ext cx="5334000" cy="2667000"/>
+                      <a:ext cx="5334000" cy="2847975"/>
                     </a:xfrm>
                     <a:prstGeom prst="rect">
                       <a:avLst/>
@@ -963,7 +672,7 @@
         <w:spacing w:after="150" w:before="300"/>
       </w:pPr>
       <w:r>
-        <w:t xml:space="preserve">Step 4.3: Verify the Live Portfolio</w:t>
+        <w:t xml:space="preserve">Step 3.3: Commit and Push the LFS Files</w:t>
       </w:r>
     </w:p>
     <w:p>
@@ -971,7 +680,7 @@
         <w:spacing w:after="150"/>
       </w:pPr>
       <w:r>
-        <w:t xml:space="preserve">Opened https://&lt;my-github-username&gt;.github.io/ and confirmed the site loads successfully with the portfolio content visible.</w:t>
+        <w:t xml:space="preserve">Committed the three LFS-tracked files and pushed them to the GitHub Assignment01 repository.</w:t>
       </w:r>
     </w:p>
     <w:p>
@@ -982,7 +691,7 @@
       <w:r>
         <w:drawing>
           <wp:inline distT="0" distB="0" distL="0" distR="0">
-            <wp:extent cx="5334000" cy="3000375"/>
+            <wp:extent cx="5114925" cy="3429000"/>
             <wp:effectExtent t="0" r="0" b="0" l="0"/>
             <wp:docPr id="9" name="" descr="" title=""/>
             <wp:cNvGraphicFramePr>
@@ -999,6 +708,219 @@
                   </pic:nvPicPr>
                   <pic:blipFill>
                     <a:blip r:embed="rId15" cstate="none"/>
+                    <a:srcRect/>
+                    <a:stretch>
+                      <a:fillRect/>
+                    </a:stretch>
+                  </pic:blipFill>
+                  <pic:spPr bwMode="auto">
+                    <a:xfrm>
+                      <a:off x="0" y="0"/>
+                      <a:ext cx="5114925" cy="3429000"/>
+                    </a:xfrm>
+                    <a:prstGeom prst="rect">
+                      <a:avLst/>
+                    </a:prstGeom>
+                  </pic:spPr>
+                </pic:pic>
+              </a:graphicData>
+            </a:graphic>
+          </wp:inline>
+        </w:drawing>
+      </w:r>
+    </w:p>
+    <w:p>
+      <w:r>
+        <w:br w:type="page"/>
+      </w:r>
+    </w:p>
+    <w:p>
+      <w:pPr>
+        <w:pStyle w:val="Heading1"/>
+        <w:spacing w:after="200" w:before="400"/>
+      </w:pPr>
+      <w:r>
+        <w:t xml:space="preserve">Task 4: Create a Portfolio or CV with GitHub Pages</w:t>
+      </w:r>
+    </w:p>
+    <w:p>
+      <w:pPr>
+        <w:pStyle w:val="Heading2"/>
+        <w:spacing w:after="150" w:before="300"/>
+      </w:pPr>
+      <w:r>
+        <w:t xml:space="preserve">Step 4.1: Create and Push the Portfolio Repository</w:t>
+      </w:r>
+    </w:p>
+    <w:p>
+      <w:pPr>
+        <w:spacing w:after="150"/>
+      </w:pPr>
+      <w:r>
+        <w:t xml:space="preserve">Created a public GitHub repository named &lt;my-github-username&gt;.github.io containing index.html and styles.css, with About Me, Education, Skills, and Projects sections. Committed and pushed the source files to the main branch.</w:t>
+      </w:r>
+    </w:p>
+    <w:p>
+      <w:pPr>
+        <w:spacing w:after="100"/>
+        <w:jc w:val="center"/>
+      </w:pPr>
+      <w:r>
+        <w:drawing>
+          <wp:inline distT="0" distB="0" distL="0" distR="0">
+            <wp:extent cx="5334000" cy="2676525"/>
+            <wp:effectExtent t="0" r="0" b="0" l="0"/>
+            <wp:docPr id="10" name="" descr="" title=""/>
+            <wp:cNvGraphicFramePr>
+              <a:graphicFrameLocks xmlns:a="http://schemas.openxmlformats.org/drawingml/2006/main" noChangeAspect="1"/>
+            </wp:cNvGraphicFramePr>
+            <a:graphic xmlns:a="http://schemas.openxmlformats.org/drawingml/2006/main">
+              <a:graphicData uri="http://schemas.openxmlformats.org/drawingml/2006/picture">
+                <pic:pic xmlns:pic="http://schemas.openxmlformats.org/drawingml/2006/picture">
+                  <pic:nvPicPr>
+                    <pic:cNvPr id="0" name="" descr=""/>
+                    <pic:cNvPicPr>
+                      <a:picLocks noChangeAspect="1" noChangeArrowheads="1"/>
+                    </pic:cNvPicPr>
+                  </pic:nvPicPr>
+                  <pic:blipFill>
+                    <a:blip r:embed="rId16" cstate="none"/>
+                    <a:srcRect/>
+                    <a:stretch>
+                      <a:fillRect/>
+                    </a:stretch>
+                  </pic:blipFill>
+                  <pic:spPr bwMode="auto">
+                    <a:xfrm>
+                      <a:off x="0" y="0"/>
+                      <a:ext cx="5334000" cy="2676525"/>
+                    </a:xfrm>
+                    <a:prstGeom prst="rect">
+                      <a:avLst/>
+                    </a:prstGeom>
+                  </pic:spPr>
+                </pic:pic>
+              </a:graphicData>
+            </a:graphic>
+          </wp:inline>
+        </w:drawing>
+      </w:r>
+    </w:p>
+    <w:p>
+      <w:pPr>
+        <w:spacing w:after="200"/>
+      </w:pPr>
+    </w:p>
+    <w:p>
+      <w:pPr>
+        <w:pStyle w:val="Heading2"/>
+        <w:spacing w:after="150" w:before="300"/>
+      </w:pPr>
+      <w:r>
+        <w:t xml:space="preserve">Step 4.2: Publish with GitHub Pages</w:t>
+      </w:r>
+    </w:p>
+    <w:p>
+      <w:pPr>
+        <w:spacing w:after="150"/>
+      </w:pPr>
+      <w:r>
+        <w:t xml:space="preserve">In repository Settings &gt; Pages, selected Deploy from a branch, chose the main branch and /(root) folder, saved, and waited for GitHub to report the site as published/live.</w:t>
+      </w:r>
+    </w:p>
+    <w:p>
+      <w:pPr>
+        <w:spacing w:after="100"/>
+        <w:jc w:val="center"/>
+      </w:pPr>
+      <w:r>
+        <w:drawing>
+          <wp:inline distT="0" distB="0" distL="0" distR="0">
+            <wp:extent cx="5334000" cy="2667000"/>
+            <wp:effectExtent t="0" r="0" b="0" l="0"/>
+            <wp:docPr id="11" name="" descr="" title=""/>
+            <wp:cNvGraphicFramePr>
+              <a:graphicFrameLocks xmlns:a="http://schemas.openxmlformats.org/drawingml/2006/main" noChangeAspect="1"/>
+            </wp:cNvGraphicFramePr>
+            <a:graphic xmlns:a="http://schemas.openxmlformats.org/drawingml/2006/main">
+              <a:graphicData uri="http://schemas.openxmlformats.org/drawingml/2006/picture">
+                <pic:pic xmlns:pic="http://schemas.openxmlformats.org/drawingml/2006/picture">
+                  <pic:nvPicPr>
+                    <pic:cNvPr id="0" name="" descr=""/>
+                    <pic:cNvPicPr>
+                      <a:picLocks noChangeAspect="1" noChangeArrowheads="1"/>
+                    </pic:cNvPicPr>
+                  </pic:nvPicPr>
+                  <pic:blipFill>
+                    <a:blip r:embed="rId17" cstate="none"/>
+                    <a:srcRect/>
+                    <a:stretch>
+                      <a:fillRect/>
+                    </a:stretch>
+                  </pic:blipFill>
+                  <pic:spPr bwMode="auto">
+                    <a:xfrm>
+                      <a:off x="0" y="0"/>
+                      <a:ext cx="5334000" cy="2667000"/>
+                    </a:xfrm>
+                    <a:prstGeom prst="rect">
+                      <a:avLst/>
+                    </a:prstGeom>
+                  </pic:spPr>
+                </pic:pic>
+              </a:graphicData>
+            </a:graphic>
+          </wp:inline>
+        </w:drawing>
+      </w:r>
+    </w:p>
+    <w:p>
+      <w:pPr>
+        <w:spacing w:after="200"/>
+      </w:pPr>
+    </w:p>
+    <w:p>
+      <w:pPr>
+        <w:pStyle w:val="Heading2"/>
+        <w:spacing w:after="150" w:before="300"/>
+      </w:pPr>
+      <w:r>
+        <w:t xml:space="preserve">Step 4.3: Verify the Live Portfolio</w:t>
+      </w:r>
+    </w:p>
+    <w:p>
+      <w:pPr>
+        <w:spacing w:after="150"/>
+      </w:pPr>
+      <w:r>
+        <w:t xml:space="preserve">Opened https://&lt;my-github-username&gt;.github.io/ and confirmed the site loads successfully with the portfolio content visible.</w:t>
+      </w:r>
+    </w:p>
+    <w:p>
+      <w:pPr>
+        <w:spacing w:after="100"/>
+        <w:jc w:val="center"/>
+      </w:pPr>
+      <w:r>
+        <w:drawing>
+          <wp:inline distT="0" distB="0" distL="0" distR="0">
+            <wp:extent cx="5334000" cy="3000375"/>
+            <wp:effectExtent t="0" r="0" b="0" l="0"/>
+            <wp:docPr id="12" name="" descr="" title=""/>
+            <wp:cNvGraphicFramePr>
+              <a:graphicFrameLocks xmlns:a="http://schemas.openxmlformats.org/drawingml/2006/main" noChangeAspect="1"/>
+            </wp:cNvGraphicFramePr>
+            <a:graphic xmlns:a="http://schemas.openxmlformats.org/drawingml/2006/main">
+              <a:graphicData uri="http://schemas.openxmlformats.org/drawingml/2006/picture">
+                <pic:pic xmlns:pic="http://schemas.openxmlformats.org/drawingml/2006/picture">
+                  <pic:nvPicPr>
+                    <pic:cNvPr id="0" name="" descr=""/>
+                    <pic:cNvPicPr>
+                      <a:picLocks noChangeAspect="1" noChangeArrowheads="1"/>
+                    </pic:cNvPicPr>
+                  </pic:nvPicPr>
+                  <pic:blipFill>
+                    <a:blip r:embed="rId18" cstate="none"/>
                     <a:srcRect/>
                     <a:stretch>
                       <a:fillRect/>

</xml_diff>